<commit_message>
docs: rename project to 类案智裁Agent and update solution docs
</commit_message>
<xml_diff>
--- a/documents/项目简介（完整版） (1).docx
+++ b/documents/项目简介（完整版） (1).docx
@@ -15,21 +15,19 @@
         <w:rPr>
           <w:rFonts w:eastAsia="宋体"/>
         </w:rPr>
-        <w:t>异智（</w:t>
-      </w:r>
-      <w:proofErr w:type="spellStart"/>
-      <w:r>
-        <w:rPr>
-          <w:rFonts w:eastAsia="宋体"/>
-        </w:rPr>
-        <w:t>YiZhi</w:t>
-      </w:r>
-      <w:proofErr w:type="spellEnd"/>
-      <w:r>
-        <w:rPr>
-          <w:rFonts w:eastAsia="宋体"/>
-        </w:rPr>
-        <w:t>）法律</w:t>
+        <w:t>类案智裁</w:t>
+      </w:r>
+      <w:r>
+        <w:rPr>
+          <w:rFonts w:eastAsia="宋体"/>
+        </w:rPr>
+        <w:t>Agent</w:t>
+      </w:r>
+      <w:r>
+        <w:rPr>
+          <w:rFonts w:eastAsia="宋体"/>
+        </w:rPr>
+        <w:t>法律</w:t>
       </w:r>
       <w:r>
         <w:rPr>
@@ -37,19 +35,11 @@
         </w:rPr>
         <w:t xml:space="preserve"> AI </w:t>
       </w:r>
-      <w:proofErr w:type="gramStart"/>
-      <w:r>
-        <w:rPr>
-          <w:rFonts w:eastAsia="宋体"/>
-        </w:rPr>
-        <w:t>类案检索</w:t>
-      </w:r>
-      <w:proofErr w:type="gramEnd"/>
-      <w:r>
-        <w:rPr>
-          <w:rFonts w:eastAsia="宋体"/>
-        </w:rPr>
-        <w:t>系统项目简介</w:t>
+      <w:r>
+        <w:rPr>
+          <w:rFonts w:eastAsia="宋体"/>
+        </w:rPr>
+        <w:t>类案检索系统项目简介</w:t>
       </w:r>
     </w:p>
     <w:p>
@@ -106,35 +96,19 @@
         <w:rPr>
           <w:rFonts w:eastAsia="宋体"/>
         </w:rPr>
-        <w:t>异智（</w:t>
-      </w:r>
-      <w:proofErr w:type="spellStart"/>
-      <w:r>
-        <w:rPr>
-          <w:rFonts w:eastAsia="宋体"/>
-        </w:rPr>
-        <w:t>YiZhi</w:t>
-      </w:r>
-      <w:proofErr w:type="spellEnd"/>
-      <w:r>
-        <w:rPr>
-          <w:rFonts w:eastAsia="宋体"/>
-        </w:rPr>
-        <w:t>）是面向法律实务场景打造</w:t>
-      </w:r>
-      <w:proofErr w:type="gramStart"/>
-      <w:r>
-        <w:rPr>
-          <w:rFonts w:eastAsia="宋体"/>
-        </w:rPr>
-        <w:t>的类案检索</w:t>
-      </w:r>
-      <w:proofErr w:type="gramEnd"/>
-      <w:r>
-        <w:rPr>
-          <w:rFonts w:eastAsia="宋体"/>
-        </w:rPr>
-        <w:t>与报告生成系统。项目定位为工具型法律</w:t>
+        <w:t>类案智裁</w:t>
+      </w:r>
+      <w:r>
+        <w:rPr>
+          <w:rFonts w:eastAsia="宋体"/>
+        </w:rPr>
+        <w:t>Agent</w:t>
+      </w:r>
+      <w:r>
+        <w:rPr>
+          <w:rFonts w:eastAsia="宋体"/>
+        </w:rPr>
+        <w:t>是面向法律实务场景打造的类案检索与报告生成系统。项目定位为工具型法律</w:t>
       </w:r>
       <w:r>
         <w:rPr>
@@ -146,35 +120,7 @@
         <w:rPr>
           <w:rFonts w:eastAsia="宋体"/>
         </w:rPr>
-        <w:t>应用，目标是在保持法律专业严谨性的前提下，显著</w:t>
-      </w:r>
-      <w:proofErr w:type="gramStart"/>
-      <w:r>
-        <w:rPr>
-          <w:rFonts w:eastAsia="宋体"/>
-        </w:rPr>
-        <w:t>降低类案检索</w:t>
-      </w:r>
-      <w:proofErr w:type="gramEnd"/>
-      <w:r>
-        <w:rPr>
-          <w:rFonts w:eastAsia="宋体"/>
-        </w:rPr>
-        <w:t>、信息整理与报告撰写的时间成本，并为后续向更复杂的法律智能</w:t>
-      </w:r>
-      <w:proofErr w:type="gramStart"/>
-      <w:r>
-        <w:rPr>
-          <w:rFonts w:eastAsia="宋体"/>
-        </w:rPr>
-        <w:t>体系统</w:t>
-      </w:r>
-      <w:proofErr w:type="gramEnd"/>
-      <w:r>
-        <w:rPr>
-          <w:rFonts w:eastAsia="宋体"/>
-        </w:rPr>
-        <w:t>演进提供稳定底座。</w:t>
+        <w:t>应用，目标是在保持法律专业严谨性的前提下，显著降低类案检索、信息整理与报告撰写的时间成本，并为后续向更复杂的法律智能体系统演进提供稳定底座。</w:t>
       </w:r>
     </w:p>
     <w:p>
@@ -210,21 +156,7 @@
         <w:rPr>
           <w:rFonts w:eastAsia="宋体"/>
         </w:rPr>
-        <w:t>传统法律检索高度依赖人工经验，用户往往需要反复试探关键词，仍可能出现检索结果过多或过少的问题。即便完成初步检索，后续仍要投入大量精力进行案例筛选、观点提炼、法律依据整理和文书撰写，整体流程长且容易因信息分散导致遗漏。</w:t>
-      </w:r>
-      <w:proofErr w:type="gramStart"/>
-      <w:r>
-        <w:rPr>
-          <w:rFonts w:eastAsia="宋体"/>
-        </w:rPr>
-        <w:t>异智项目</w:t>
-      </w:r>
-      <w:proofErr w:type="gramEnd"/>
-      <w:r>
-        <w:rPr>
-          <w:rFonts w:eastAsia="宋体"/>
-        </w:rPr>
-        <w:t>围绕这些现实痛点，构建了</w:t>
+        <w:t>类案检索作为法律从业者研判案件、构建诉讼策略的基础工作，更是司法实践统一法律适用、落实类案同判的重要方式。然而，传统法律检索高度依赖执业者的实务经验，检索者需反复调试检索关键词，常出现检索结果冗余繁杂或检索范围不足的情况。即便完成初步检索，后续仍需耗费大量人力完成案例甄别、裁判观点提炼、法律规范梳理与法律文书撰写等工作，整体流程繁琐冗长，且易因信息碎片化造成关键裁判观点与法律依据的遗漏。为适配数字化司法建设与法律服务升级的发展趋势，异智项目聚焦于前述的核心通带，以技术赋能法律实务，构建</w:t>
       </w:r>
       <w:r>
         <w:rPr>
@@ -236,7 +168,7 @@
         <w:rPr>
           <w:rFonts w:eastAsia="宋体"/>
         </w:rPr>
-        <w:t>检索</w:t>
+        <w:t>自然语言检索</w:t>
       </w:r>
       <w:r>
         <w:rPr>
@@ -272,7 +204,7 @@
         <w:rPr>
           <w:rFonts w:eastAsia="宋体"/>
         </w:rPr>
-        <w:t>的一体化工作流，希望把碎片化人工流程转换为可复用、可验证、可持续优化的工程化流程。</w:t>
+        <w:t>的一体化工作流，通过将碎片化人工流程转换为可复用、可验证、可持续优化的工程化流程，推动法律服务工作提质增效。</w:t>
       </w:r>
     </w:p>
     <w:p>
@@ -293,21 +225,7 @@
         <w:rPr>
           <w:rFonts w:eastAsia="宋体"/>
         </w:rPr>
-        <w:t>技术</w:t>
-      </w:r>
-      <w:proofErr w:type="gramStart"/>
-      <w:r>
-        <w:rPr>
-          <w:rFonts w:eastAsia="宋体"/>
-        </w:rPr>
-        <w:t>栈</w:t>
-      </w:r>
-      <w:proofErr w:type="gramEnd"/>
-      <w:r>
-        <w:rPr>
-          <w:rFonts w:eastAsia="宋体"/>
-        </w:rPr>
-        <w:t>与系统构成</w:t>
+        <w:t>技术栈与系统构成</w:t>
       </w:r>
     </w:p>
     <w:p>
@@ -481,21 +399,7 @@
         <w:rPr>
           <w:rFonts w:eastAsia="宋体"/>
         </w:rPr>
-        <w:t>约束）；当前接入供应商为</w:t>
-      </w:r>
-      <w:proofErr w:type="gramStart"/>
-      <w:r>
-        <w:rPr>
-          <w:rFonts w:eastAsia="宋体"/>
-        </w:rPr>
-        <w:t>腾讯混</w:t>
-      </w:r>
-      <w:proofErr w:type="gramEnd"/>
-      <w:r>
-        <w:rPr>
-          <w:rFonts w:eastAsia="宋体"/>
-        </w:rPr>
-        <w:t>元大模型</w:t>
+        <w:t>约束）；当前接入供应商为腾讯混元大模型</w:t>
       </w:r>
       <w:r>
         <w:rPr>
@@ -706,16 +610,8 @@
         <w:rPr>
           <w:rFonts w:eastAsia="宋体"/>
         </w:rPr>
-        <w:t>或前端页面直接触发工作流，自动</w:t>
-      </w:r>
-      <w:proofErr w:type="gramStart"/>
-      <w:r>
-        <w:rPr>
-          <w:rFonts w:eastAsia="宋体"/>
-        </w:rPr>
-        <w:t>输出类案检索</w:t>
-      </w:r>
-      <w:proofErr w:type="gramEnd"/>
+        <w:t>或前端页面直接触发工作流，自动输出类案检索</w:t>
+      </w:r>
       <w:r>
         <w:rPr>
           <w:rFonts w:eastAsia="宋体"/>
@@ -833,6 +729,62 @@
     </w:p>
     <w:p>
       <w:pPr>
+        <w:ind w:firstLine="480"/>
+        <w:rPr>
+          <w:rFonts w:eastAsia="宋体"/>
+        </w:rPr>
+      </w:pPr>
+      <w:r>
+        <w:rPr>
+          <w:rFonts w:eastAsia="宋体"/>
+        </w:rPr>
+        <w:t>本项目的核心服务对象为法律实务相关从业者，主要涵盖执业律师、司法系统工</w:t>
+      </w:r>
+      <w:r>
+        <w:rPr>
+          <w:rFonts w:eastAsia="宋体"/>
+        </w:rPr>
+        <w:lastRenderedPageBreak/>
+        <w:t>作人员、企业法务人员与法律科技研发团队等。上述群体均为类案检索的高频使用者，对检索效率、分析精度与成果标准化具有刚性需求。</w:t>
+      </w:r>
+    </w:p>
+    <w:p>
+      <w:pPr>
+        <w:ind w:firstLine="480"/>
+        <w:rPr>
+          <w:rFonts w:eastAsia="宋体"/>
+        </w:rPr>
+      </w:pPr>
+      <w:r>
+        <w:rPr>
+          <w:rFonts w:eastAsia="宋体"/>
+        </w:rPr>
+        <w:t>在司法实务工作中，目标用户普遍面临三大核心痛点。其一，检索精准度不足，关键词匹配依赖个人经验，难以快速定位高匹配度类案，无效信息占用大量工作时间。其二，信息处理效率低下，裁判文书以非结构化文本为主，人工完成案例比对、观点萃取、法条整合的工作强度大，成果难以标准化复用。其三，分析成果转化困难，零散的检索信息无法快速形成体系化论证依据，难以直接支撑文书撰写与法律推演，制约了法律工作的专业效能与产出质量。</w:t>
+      </w:r>
+    </w:p>
+    <w:p>
+      <w:pPr>
+        <w:pStyle w:val="3"/>
+        <w:spacing w:after="200"/>
+        <w:rPr>
+          <w:rFonts w:eastAsia="宋体"/>
+        </w:rPr>
+      </w:pPr>
+      <w:r>
+        <w:rPr>
+          <w:rFonts w:eastAsia="宋体"/>
+        </w:rPr>
+        <w:t xml:space="preserve">2.2 </w:t>
+      </w:r>
+      <w:r>
+        <w:rPr>
+          <w:rFonts w:eastAsia="宋体"/>
+        </w:rPr>
+        <w:t>功能需求与非功能需求</w:t>
+      </w:r>
+    </w:p>
+    <w:p>
+      <w:pPr>
         <w:spacing w:after="120"/>
         <w:ind w:firstLine="480"/>
         <w:rPr>
@@ -841,37 +793,39 @@
       </w:pPr>
       <w:r>
         <w:rPr>
-          <w:rFonts w:eastAsia="宋体"/>
-        </w:rPr>
-        <w:t>本项目主要服务律师、法官助理、企业法</w:t>
-      </w:r>
-      <w:proofErr w:type="gramStart"/>
-      <w:r>
-        <w:rPr>
-          <w:rFonts w:eastAsia="宋体"/>
-        </w:rPr>
-        <w:t>务</w:t>
-      </w:r>
-      <w:proofErr w:type="gramEnd"/>
-      <w:r>
-        <w:rPr>
-          <w:rFonts w:eastAsia="宋体"/>
-        </w:rPr>
-        <w:t>及法律科技研发团队。共同痛点在于，</w:t>
-      </w:r>
-      <w:proofErr w:type="gramStart"/>
-      <w:r>
-        <w:rPr>
-          <w:rFonts w:eastAsia="宋体"/>
-        </w:rPr>
-        <w:t>类案检索</w:t>
-      </w:r>
-      <w:proofErr w:type="gramEnd"/>
-      <w:r>
-        <w:rPr>
-          <w:rFonts w:eastAsia="宋体"/>
-        </w:rPr>
-        <w:t>并不止是</w:t>
+          <w:rFonts w:eastAsia="宋体" w:hint="eastAsia"/>
+        </w:rPr>
+        <w:t>在功能层面，系统需要支持自然语言交互检索，使用户无需精准提炼专业术语与检索关键词，即可完成候选案例召回、核心字段智能抽取与法律依据补全，并同步生成</w:t>
+      </w:r>
+      <w:r>
+        <w:rPr>
+          <w:rFonts w:eastAsia="宋体" w:hint="eastAsia"/>
+        </w:rPr>
+        <w:t>Excel</w:t>
+      </w:r>
+      <w:r>
+        <w:rPr>
+          <w:rFonts w:eastAsia="宋体" w:hint="eastAsia"/>
+        </w:rPr>
+        <w:t>、</w:t>
+      </w:r>
+      <w:r>
+        <w:rPr>
+          <w:rFonts w:eastAsia="宋体" w:hint="eastAsia"/>
+        </w:rPr>
+        <w:t>Word</w:t>
+      </w:r>
+      <w:r>
+        <w:rPr>
+          <w:rFonts w:eastAsia="宋体" w:hint="eastAsia"/>
+        </w:rPr>
+        <w:t>双格式标准化成果文件。</w:t>
+      </w:r>
+      <w:r>
+        <w:rPr>
+          <w:rFonts w:eastAsia="宋体"/>
+        </w:rPr>
+        <w:t>其中</w:t>
       </w:r>
       <w:r>
         <w:rPr>
@@ -883,7 +837,7 @@
         <w:rPr>
           <w:rFonts w:eastAsia="宋体"/>
         </w:rPr>
-        <w:t>找到文书</w:t>
+        <w:t>主要原因</w:t>
       </w:r>
       <w:r>
         <w:rPr>
@@ -895,7 +849,112 @@
         <w:rPr>
           <w:rFonts w:eastAsia="宋体"/>
         </w:rPr>
-        <w:t>，更难的是把文书转化为可比较、可论证、可复用的结构化结论。项目的核心价值不是替代专业法律判断，而是通过系统化流程提升检索效率与分析质量，让用户把更多精力放在法律推理本身。</w:t>
+        <w:t>与</w:t>
+      </w:r>
+      <w:r>
+        <w:rPr>
+          <w:rFonts w:eastAsia="宋体"/>
+        </w:rPr>
+        <w:t>“</w:t>
+      </w:r>
+      <w:r>
+        <w:rPr>
+          <w:rFonts w:eastAsia="宋体"/>
+        </w:rPr>
+        <w:t>关键裁判结论（权利类</w:t>
+      </w:r>
+      <w:r>
+        <w:rPr>
+          <w:rFonts w:eastAsia="宋体"/>
+        </w:rPr>
+        <w:t>/</w:t>
+      </w:r>
+      <w:r>
+        <w:rPr>
+          <w:rFonts w:eastAsia="宋体"/>
+        </w:rPr>
+        <w:t>金额类</w:t>
+      </w:r>
+      <w:r>
+        <w:rPr>
+          <w:rFonts w:eastAsia="宋体"/>
+        </w:rPr>
+        <w:t>/</w:t>
+      </w:r>
+      <w:r>
+        <w:rPr>
+          <w:rFonts w:eastAsia="宋体"/>
+        </w:rPr>
+        <w:t>行为类）</w:t>
+      </w:r>
+      <w:r>
+        <w:rPr>
+          <w:rFonts w:eastAsia="宋体"/>
+        </w:rPr>
+        <w:t>”</w:t>
+      </w:r>
+      <w:r>
+        <w:rPr>
+          <w:rFonts w:eastAsia="宋体"/>
+        </w:rPr>
+        <w:t>是业务重点字段</w:t>
+      </w:r>
+      <w:r>
+        <w:rPr>
+          <w:rFonts w:eastAsia="宋体"/>
+        </w:rPr>
+        <w:t>；</w:t>
+      </w:r>
+      <w:r>
+        <w:rPr>
+          <w:rFonts w:eastAsia="宋体"/>
+        </w:rPr>
+        <w:t>从非功能层面，系统强调结果可读性、过程可追溯性、服务稳定性和生成效率，要求输出不仅</w:t>
+      </w:r>
+      <w:r>
+        <w:rPr>
+          <w:rFonts w:eastAsia="宋体"/>
+        </w:rPr>
+        <w:t>“</w:t>
+      </w:r>
+      <w:r>
+        <w:rPr>
+          <w:rFonts w:eastAsia="宋体"/>
+        </w:rPr>
+        <w:t>能生成</w:t>
+      </w:r>
+      <w:r>
+        <w:rPr>
+          <w:rFonts w:eastAsia="宋体"/>
+        </w:rPr>
+        <w:t>”</w:t>
+      </w:r>
+      <w:r>
+        <w:rPr>
+          <w:rFonts w:eastAsia="宋体"/>
+        </w:rPr>
+        <w:t>，还要具备业务可用价值与后续复核基础。</w:t>
+      </w:r>
+    </w:p>
+    <w:p>
+      <w:pPr>
+        <w:pStyle w:val="2"/>
+        <w:spacing w:after="200"/>
+        <w:rPr>
+          <w:rFonts w:eastAsia="宋体"/>
+        </w:rPr>
+      </w:pPr>
+      <w:r>
+        <w:rPr>
+          <w:rFonts w:eastAsia="宋体"/>
+        </w:rPr>
+        <w:t xml:space="preserve">3. </w:t>
+      </w:r>
+      <w:r>
+        <w:rPr>
+          <w:rFonts w:eastAsia="宋体"/>
+        </w:rPr>
+        <w:t>解决方案思路</w:t>
       </w:r>
     </w:p>
     <w:p>
@@ -910,14 +969,13 @@
         <w:rPr>
           <w:rFonts w:eastAsia="宋体"/>
         </w:rPr>
-        <w:lastRenderedPageBreak/>
-        <w:t xml:space="preserve">2.2 </w:t>
-      </w:r>
-      <w:r>
-        <w:rPr>
-          <w:rFonts w:eastAsia="宋体"/>
-        </w:rPr>
-        <w:t>功能需求与非功能需求</w:t>
+        <w:t xml:space="preserve">3.1 </w:t>
+      </w:r>
+      <w:r>
+        <w:rPr>
+          <w:rFonts w:eastAsia="宋体"/>
+        </w:rPr>
+        <w:t>总体方案</w:t>
       </w:r>
     </w:p>
     <w:p>
@@ -932,31 +990,19 @@
         <w:rPr>
           <w:rFonts w:eastAsia="宋体"/>
         </w:rPr>
-        <w:t>从功能层面，系统需要支持自然语言输入，完成候选案例召回、关键字段抽取、法律依据补全，并输出</w:t>
-      </w:r>
-      <w:r>
-        <w:rPr>
-          <w:rFonts w:eastAsia="宋体"/>
-        </w:rPr>
-        <w:t xml:space="preserve"> Excel </w:t>
-      </w:r>
-      <w:r>
-        <w:rPr>
-          <w:rFonts w:eastAsia="宋体"/>
-        </w:rPr>
-        <w:t>与</w:t>
-      </w:r>
-      <w:r>
-        <w:rPr>
-          <w:rFonts w:eastAsia="宋体"/>
-        </w:rPr>
-        <w:t xml:space="preserve"> Word </w:t>
-      </w:r>
-      <w:r>
-        <w:rPr>
-          <w:rFonts w:eastAsia="宋体"/>
-        </w:rPr>
-        <w:t>两类产物。其中</w:t>
+        <w:t>类案智裁</w:t>
+      </w:r>
+      <w:r>
+        <w:rPr>
+          <w:rFonts w:eastAsia="宋体"/>
+        </w:rPr>
+        <w:t>Agent</w:t>
+      </w:r>
+      <w:r>
+        <w:rPr>
+          <w:rFonts w:eastAsia="宋体"/>
+        </w:rPr>
+        <w:t>采用</w:t>
       </w:r>
       <w:r>
         <w:rPr>
@@ -966,9 +1012,33 @@
       </w:r>
       <w:r>
         <w:rPr>
-          <w:rFonts w:eastAsia="宋体"/>
-        </w:rPr>
-        <w:t>主要原因</w:t>
+          <w:rFonts w:eastAsia="宋体" w:hint="eastAsia"/>
+        </w:rPr>
+        <w:t>自然语言检索</w:t>
+      </w:r>
+      <w:r>
+        <w:rPr>
+          <w:rFonts w:eastAsia="宋体"/>
+        </w:rPr>
+        <w:t xml:space="preserve">+ </w:t>
+      </w:r>
+      <w:r>
+        <w:rPr>
+          <w:rFonts w:eastAsia="宋体"/>
+        </w:rPr>
+        <w:t>结构化抽取</w:t>
+      </w:r>
+      <w:r>
+        <w:rPr>
+          <w:rFonts w:eastAsia="宋体"/>
+        </w:rPr>
+        <w:t xml:space="preserve"> + </w:t>
+      </w:r>
+      <w:r>
+        <w:rPr>
+          <w:rFonts w:eastAsia="宋体"/>
+        </w:rPr>
+        <w:t>模板化生成</w:t>
       </w:r>
       <w:r>
         <w:rPr>
@@ -980,212 +1050,7 @@
         <w:rPr>
           <w:rFonts w:eastAsia="宋体"/>
         </w:rPr>
-        <w:t>与</w:t>
-      </w:r>
-      <w:r>
-        <w:rPr>
-          <w:rFonts w:eastAsia="宋体"/>
-        </w:rPr>
-        <w:t>“</w:t>
-      </w:r>
-      <w:r>
-        <w:rPr>
-          <w:rFonts w:eastAsia="宋体"/>
-        </w:rPr>
-        <w:t>关键裁判结论（权利类</w:t>
-      </w:r>
-      <w:r>
-        <w:rPr>
-          <w:rFonts w:eastAsia="宋体"/>
-        </w:rPr>
-        <w:t>/</w:t>
-      </w:r>
-      <w:r>
-        <w:rPr>
-          <w:rFonts w:eastAsia="宋体"/>
-        </w:rPr>
-        <w:t>金额类</w:t>
-      </w:r>
-      <w:r>
-        <w:rPr>
-          <w:rFonts w:eastAsia="宋体"/>
-        </w:rPr>
-        <w:t>/</w:t>
-      </w:r>
-      <w:r>
-        <w:rPr>
-          <w:rFonts w:eastAsia="宋体"/>
-        </w:rPr>
-        <w:t>行为类）</w:t>
-      </w:r>
-      <w:r>
-        <w:rPr>
-          <w:rFonts w:eastAsia="宋体"/>
-        </w:rPr>
-        <w:t>”</w:t>
-      </w:r>
-      <w:r>
-        <w:rPr>
-          <w:rFonts w:eastAsia="宋体"/>
-        </w:rPr>
-        <w:t>是业务重点字段</w:t>
-      </w:r>
-      <w:r>
-        <w:rPr>
-          <w:rFonts w:eastAsia="宋体"/>
-        </w:rPr>
-        <w:t>；</w:t>
-      </w:r>
-      <w:r>
-        <w:rPr>
-          <w:rFonts w:eastAsia="宋体"/>
-        </w:rPr>
-        <w:t>从非功能层面，系统强调结果可读性、过程可追溯性、服务稳定性和生成效率，要求输出不仅</w:t>
-      </w:r>
-      <w:r>
-        <w:rPr>
-          <w:rFonts w:eastAsia="宋体"/>
-        </w:rPr>
-        <w:t>“</w:t>
-      </w:r>
-      <w:r>
-        <w:rPr>
-          <w:rFonts w:eastAsia="宋体"/>
-        </w:rPr>
-        <w:t>能生成</w:t>
-      </w:r>
-      <w:r>
-        <w:rPr>
-          <w:rFonts w:eastAsia="宋体"/>
-        </w:rPr>
-        <w:t>”</w:t>
-      </w:r>
-      <w:r>
-        <w:rPr>
-          <w:rFonts w:eastAsia="宋体"/>
-        </w:rPr>
-        <w:t>，还要具备业务可用价值与后续复核基础。</w:t>
-      </w:r>
-    </w:p>
-    <w:p>
-      <w:pPr>
-        <w:pStyle w:val="2"/>
-        <w:spacing w:after="200"/>
-        <w:rPr>
-          <w:rFonts w:eastAsia="宋体"/>
-        </w:rPr>
-      </w:pPr>
-      <w:r>
-        <w:rPr>
-          <w:rFonts w:eastAsia="宋体"/>
-        </w:rPr>
-        <w:t xml:space="preserve">3. </w:t>
-      </w:r>
-      <w:r>
-        <w:rPr>
-          <w:rFonts w:eastAsia="宋体"/>
-        </w:rPr>
-        <w:t>解决方案思路</w:t>
-      </w:r>
-    </w:p>
-    <w:p>
-      <w:pPr>
-        <w:pStyle w:val="3"/>
-        <w:spacing w:after="200"/>
-        <w:rPr>
-          <w:rFonts w:eastAsia="宋体"/>
-        </w:rPr>
-      </w:pPr>
-      <w:r>
-        <w:rPr>
-          <w:rFonts w:eastAsia="宋体"/>
-        </w:rPr>
-        <w:t xml:space="preserve">3.1 </w:t>
-      </w:r>
-      <w:r>
-        <w:rPr>
-          <w:rFonts w:eastAsia="宋体"/>
-        </w:rPr>
-        <w:t>总体方案</w:t>
-      </w:r>
-    </w:p>
-    <w:p>
-      <w:pPr>
-        <w:spacing w:after="120"/>
-        <w:ind w:firstLine="480"/>
-        <w:rPr>
-          <w:rFonts w:eastAsia="宋体"/>
-        </w:rPr>
-      </w:pPr>
-      <w:proofErr w:type="gramStart"/>
-      <w:r>
-        <w:rPr>
-          <w:rFonts w:eastAsia="宋体"/>
-        </w:rPr>
-        <w:t>异智采用</w:t>
-      </w:r>
-      <w:proofErr w:type="gramEnd"/>
-      <w:r>
-        <w:rPr>
-          <w:rFonts w:eastAsia="宋体"/>
-        </w:rPr>
-        <w:t>“</w:t>
-      </w:r>
-      <w:r>
-        <w:rPr>
-          <w:rFonts w:eastAsia="宋体"/>
-        </w:rPr>
-        <w:t>检索增强</w:t>
-      </w:r>
-      <w:r>
-        <w:rPr>
-          <w:rFonts w:eastAsia="宋体"/>
-        </w:rPr>
-        <w:t xml:space="preserve"> + </w:t>
-      </w:r>
-      <w:r>
-        <w:rPr>
-          <w:rFonts w:eastAsia="宋体"/>
-        </w:rPr>
-        <w:t>结构化抽取</w:t>
-      </w:r>
-      <w:r>
-        <w:rPr>
-          <w:rFonts w:eastAsia="宋体"/>
-        </w:rPr>
-        <w:t xml:space="preserve"> + </w:t>
-      </w:r>
-      <w:r>
-        <w:rPr>
-          <w:rFonts w:eastAsia="宋体"/>
-        </w:rPr>
-        <w:t>模板化生成</w:t>
-      </w:r>
-      <w:r>
-        <w:rPr>
-          <w:rFonts w:eastAsia="宋体"/>
-        </w:rPr>
-        <w:t>”</w:t>
-      </w:r>
-      <w:r>
-        <w:rPr>
-          <w:rFonts w:eastAsia="宋体"/>
-        </w:rPr>
-        <w:t>的实现路径。系统先通过检索接口获取案例与法律数据，再由大模型执行结构化信息提炼，最后将结果装配为标准化文档输出。这样的方案可以兼顾召回覆盖率与成果可用性，适用于</w:t>
-      </w:r>
-      <w:proofErr w:type="gramStart"/>
-      <w:r>
-        <w:rPr>
-          <w:rFonts w:eastAsia="宋体"/>
-        </w:rPr>
-        <w:t>类案分析</w:t>
-      </w:r>
-      <w:proofErr w:type="gramEnd"/>
-      <w:r>
-        <w:rPr>
-          <w:rFonts w:eastAsia="宋体"/>
-        </w:rPr>
-        <w:t>中</w:t>
+        <w:t>的实现路径。系统先通过检索接口获取案例与法律数据，再由大模型执行结构化信息提炼，最后将结果装配为标准化文档输出。这样的方案可以兼顾召回覆盖率与成果可用性，适用于类案分析中</w:t>
       </w:r>
       <w:r>
         <w:rPr>
@@ -1530,21 +1395,7 @@
         <w:rPr>
           <w:rFonts w:eastAsia="宋体"/>
         </w:rPr>
-        <w:t>本项目在设计上强调低耦合、可扩展和</w:t>
-      </w:r>
-      <w:proofErr w:type="gramStart"/>
-      <w:r>
-        <w:rPr>
-          <w:rFonts w:eastAsia="宋体"/>
-        </w:rPr>
-        <w:t>可</w:t>
-      </w:r>
-      <w:proofErr w:type="gramEnd"/>
-      <w:r>
-        <w:rPr>
-          <w:rFonts w:eastAsia="宋体"/>
-        </w:rPr>
-        <w:t>维护。检索、抽取、导出等模块边界清晰，便于按阶段优化；</w:t>
+        <w:t>本项目在设计上强调低耦合、可扩展和可维护。检索、抽取、导出等模块边界清晰，便于按阶段优化；</w:t>
       </w:r>
       <w:r>
         <w:rPr>
@@ -1571,6 +1422,7 @@
         <w:rPr>
           <w:rFonts w:eastAsia="宋体"/>
         </w:rPr>
+        <w:lastRenderedPageBreak/>
         <w:t xml:space="preserve">4. </w:t>
       </w:r>
       <w:r>
@@ -1606,7 +1458,7 @@
         <w:spacing w:after="120"/>
         <w:ind w:firstLine="480"/>
         <w:rPr>
-          <w:rFonts w:eastAsia="宋体" w:hint="eastAsia"/>
+          <w:rFonts w:eastAsia="宋体"/>
         </w:rPr>
       </w:pPr>
       <w:r>
@@ -1676,7 +1528,6 @@
         <w:rPr>
           <w:rFonts w:eastAsia="宋体"/>
         </w:rPr>
-        <w:lastRenderedPageBreak/>
         <w:t xml:space="preserve">4.2 </w:t>
       </w:r>
       <w:r>
@@ -1691,7 +1542,7 @@
         <w:spacing w:after="120"/>
         <w:ind w:firstLine="480"/>
         <w:rPr>
-          <w:rFonts w:eastAsia="宋体" w:hint="eastAsia"/>
+          <w:rFonts w:eastAsia="宋体"/>
         </w:rPr>
       </w:pPr>
       <w:r>
@@ -1770,21 +1621,7 @@
         <w:rPr>
           <w:rFonts w:eastAsia="宋体"/>
         </w:rPr>
-        <w:t>的结果表达。</w:t>
-      </w:r>
-      <w:proofErr w:type="gramStart"/>
-      <w:r>
-        <w:rPr>
-          <w:rFonts w:eastAsia="宋体"/>
-        </w:rPr>
-        <w:t>报告侧会进一步</w:t>
-      </w:r>
-      <w:proofErr w:type="gramEnd"/>
-      <w:r>
-        <w:rPr>
-          <w:rFonts w:eastAsia="宋体"/>
-        </w:rPr>
-        <w:t>对这些依据做分布性呈现，帮助用户快速建立</w:t>
+        <w:t>的结果表达。报告侧会进一步对这些依据做分布性呈现，帮助用户快速建立</w:t>
       </w:r>
       <w:r>
         <w:rPr>
@@ -2285,47 +2122,23 @@
         </w:rPr>
         <w:t>在律师办案场景中，</w:t>
       </w:r>
-      <w:proofErr w:type="gramStart"/>
-      <w:r>
-        <w:rPr>
-          <w:rFonts w:eastAsia="宋体"/>
-        </w:rPr>
-        <w:t>异智可用</w:t>
-      </w:r>
-      <w:proofErr w:type="gramEnd"/>
-      <w:r>
-        <w:rPr>
-          <w:rFonts w:eastAsia="宋体"/>
-        </w:rPr>
-        <w:t>于诉前检索与裁判规则梳理，帮助快速形成论证框架；在法院辅助场景中，可用</w:t>
-      </w:r>
-      <w:proofErr w:type="gramStart"/>
-      <w:r>
-        <w:rPr>
-          <w:rFonts w:eastAsia="宋体"/>
-        </w:rPr>
-        <w:t>于类案</w:t>
-      </w:r>
-      <w:proofErr w:type="gramEnd"/>
-      <w:r>
-        <w:rPr>
-          <w:rFonts w:eastAsia="宋体"/>
-        </w:rPr>
-        <w:t>归纳与审理思路参考；在企业法</w:t>
-      </w:r>
-      <w:proofErr w:type="gramStart"/>
-      <w:r>
-        <w:rPr>
-          <w:rFonts w:eastAsia="宋体"/>
-        </w:rPr>
-        <w:t>务</w:t>
-      </w:r>
-      <w:proofErr w:type="gramEnd"/>
-      <w:r>
-        <w:rPr>
-          <w:rFonts w:eastAsia="宋体"/>
-        </w:rPr>
-        <w:t>场景中，可用于纠纷风险识别与决策支持；在法律科技研发与教学研究场景中，又可以作为可复用的数据处理与规则提炼基础设施。不同角色的共同收益在于，把重复性的信息处理工作交给系统，把高价值判断留给专业人员。</w:t>
+      <w:r>
+        <w:rPr>
+          <w:rFonts w:eastAsia="宋体"/>
+        </w:rPr>
+        <w:t>类案智裁</w:t>
+      </w:r>
+      <w:r>
+        <w:rPr>
+          <w:rFonts w:eastAsia="宋体"/>
+        </w:rPr>
+        <w:t>Agent</w:t>
+      </w:r>
+      <w:r>
+        <w:rPr>
+          <w:rFonts w:eastAsia="宋体"/>
+        </w:rPr>
+        <w:t>可用于诉前检索与裁判规则梳理，帮助快速形成论证框架；在法院辅助场景中，可用于类案归纳与审理思路参考；在企业法务场景中，可用于纠纷风险识别与决策支持；在法律科技研发与教学研究场景中，又可以作为可复用的数据处理与规则提炼基础设施。不同角色的共同收益在于，把重复性的信息处理工作交给系统，把高价值判断留给专业人员。</w:t>
       </w:r>
     </w:p>
     <w:p>
@@ -2340,6 +2153,7 @@
         <w:rPr>
           <w:rFonts w:eastAsia="宋体"/>
         </w:rPr>
+        <w:lastRenderedPageBreak/>
         <w:t xml:space="preserve">6. AI </w:t>
       </w:r>
       <w:r>
@@ -2405,16 +2219,8 @@
         <w:rPr>
           <w:rFonts w:eastAsia="宋体"/>
         </w:rPr>
-        <w:t>：</w:t>
-      </w:r>
-      <w:proofErr w:type="gramStart"/>
-      <w:r>
-        <w:rPr>
-          <w:rFonts w:eastAsia="宋体"/>
-        </w:rPr>
-        <w:t>生成类案检索</w:t>
-      </w:r>
-      <w:proofErr w:type="gramEnd"/>
+        <w:t>：生成类案检索</w:t>
+      </w:r>
       <w:r>
         <w:rPr>
           <w:rFonts w:eastAsia="宋体"/>
@@ -2451,16 +2257,8 @@
         <w:rPr>
           <w:rFonts w:eastAsia="宋体"/>
         </w:rPr>
-        <w:t>：</w:t>
-      </w:r>
-      <w:proofErr w:type="gramStart"/>
-      <w:r>
-        <w:rPr>
-          <w:rFonts w:eastAsia="宋体"/>
-        </w:rPr>
-        <w:t>生成类案检索</w:t>
-      </w:r>
-      <w:proofErr w:type="gramEnd"/>
+        <w:t>：生成类案检索</w:t>
+      </w:r>
       <w:r>
         <w:rPr>
           <w:rFonts w:eastAsia="宋体"/>
@@ -2524,7 +2322,6 @@
         <w:rPr>
           <w:rFonts w:eastAsia="宋体"/>
         </w:rPr>
-        <w:lastRenderedPageBreak/>
         <w:t xml:space="preserve">6.2 Prompt </w:t>
       </w:r>
       <w:r>
@@ -2961,21 +2758,7 @@
         <w:rPr>
           <w:rFonts w:eastAsia="宋体"/>
         </w:rPr>
-        <w:t>本项目当前对接</w:t>
-      </w:r>
-      <w:proofErr w:type="gramStart"/>
-      <w:r>
-        <w:rPr>
-          <w:rFonts w:eastAsia="宋体"/>
-        </w:rPr>
-        <w:t>腾讯混</w:t>
-      </w:r>
-      <w:proofErr w:type="gramEnd"/>
-      <w:r>
-        <w:rPr>
-          <w:rFonts w:eastAsia="宋体"/>
-        </w:rPr>
-        <w:t>元大模型</w:t>
+        <w:t>本项目当前对接腾讯混元大模型</w:t>
       </w:r>
       <w:r>
         <w:rPr>
@@ -3083,65 +2866,37 @@
     </w:p>
     <w:p>
       <w:pPr>
-        <w:spacing w:after="120"/>
-        <w:ind w:firstLine="480"/>
-        <w:rPr>
-          <w:rFonts w:eastAsia="宋体"/>
-        </w:rPr>
-      </w:pPr>
-      <w:r>
-        <w:rPr>
-          <w:rFonts w:eastAsia="宋体"/>
-        </w:rPr>
-        <w:t>从业务角度看，</w:t>
-      </w:r>
-      <w:proofErr w:type="gramStart"/>
-      <w:r>
-        <w:rPr>
-          <w:rFonts w:eastAsia="宋体"/>
-        </w:rPr>
-        <w:t>异智降低</w:t>
-      </w:r>
-      <w:proofErr w:type="gramEnd"/>
-      <w:r>
-        <w:rPr>
-          <w:rFonts w:eastAsia="宋体"/>
-        </w:rPr>
-        <w:t>了法律检索与报告撰写的人力成本，提升了团队产出的标准化程度，也缩短了从问题输入到成果输出的周期。从技术角度看，项目已经形成可扩展的法律</w:t>
-      </w:r>
-      <w:r>
-        <w:rPr>
-          <w:rFonts w:eastAsia="宋体"/>
-        </w:rPr>
-        <w:t xml:space="preserve"> AI </w:t>
-      </w:r>
-      <w:r>
-        <w:rPr>
-          <w:rFonts w:eastAsia="宋体"/>
-        </w:rPr>
-        <w:t>工作流范式，实现了检索能力、</w:t>
-      </w:r>
-      <w:r>
-        <w:rPr>
-          <w:rFonts w:eastAsia="宋体"/>
-        </w:rPr>
-        <w:t xml:space="preserve">LLM </w:t>
-      </w:r>
-      <w:r>
-        <w:rPr>
-          <w:rFonts w:eastAsia="宋体"/>
-        </w:rPr>
-        <w:t>能力与文档生成能力的工程化整合，为多案由、多模板、多角色协作奠定了基础。后续项目将继续围绕容错重试、评测体系和自动化测试等方向迭代，以提升系统稳定性与长期可维护性。</w:t>
-      </w:r>
-    </w:p>
-    <w:p>
-      <w:pPr>
         <w:spacing w:after="200"/>
         <w:ind w:firstLine="480"/>
         <w:rPr>
           <w:rFonts w:eastAsia="宋体"/>
         </w:rPr>
       </w:pPr>
+      <w:r>
+        <w:rPr>
+          <w:rFonts w:eastAsia="宋体" w:hint="eastAsia"/>
+        </w:rPr>
+        <w:t>本项目立足法律实务数字化转型需求，以智能化技术重构类案检索全流程。业务层面，异智有效降低法律检索与案例分析报告撰写的人力成本，统一团队工作标准与输出质量，大幅压缩从法律问题提出到专业成果落地的全流程周期。技术层面，项目已经形成可扩展的法律</w:t>
+      </w:r>
+      <w:r>
+        <w:rPr>
+          <w:rFonts w:eastAsia="宋体" w:hint="eastAsia"/>
+        </w:rPr>
+        <w:t xml:space="preserve"> AI </w:t>
+      </w:r>
+      <w:r>
+        <w:rPr>
+          <w:rFonts w:eastAsia="宋体" w:hint="eastAsia"/>
+        </w:rPr>
+        <w:t>工作流范式，实现了检索能力、大语言模型能力与文档生成能力的工程化整合，为适配多案由场景、多文书模板及多角色协同作业筑牢技术基础。后续项目将围绕容错重试、评测体系搭建与自动化测试持续优化迭代，进一步提升系统运行稳定性与长期运维能力，以技术赋能法律实务，实现法律服务工作的提质</w:t>
+      </w:r>
+      <w:r>
+        <w:rPr>
+          <w:rFonts w:eastAsia="宋体" w:hint="eastAsia"/>
+        </w:rPr>
+        <w:lastRenderedPageBreak/>
+        <w:t>增效。</w:t>
+      </w:r>
       <w:r>
         <w:rPr>
           <w:rFonts w:eastAsia="宋体"/>
@@ -3856,6 +3611,7 @@
   <w:style w:type="character" w:default="1" w:styleId="a0">
     <w:name w:val="Default Paragraph Font"/>
     <w:uiPriority w:val="1"/>
+    <w:semiHidden/>
     <w:unhideWhenUsed/>
   </w:style>
   <w:style w:type="table" w:default="1" w:styleId="a1">

</xml_diff>